<commit_message>
docs: readme y publicacion
</commit_message>
<xml_diff>
--- a/ficha-proyecto.docx
+++ b/ficha-proyecto.docx
@@ -83,12 +83,6 @@
         <w:gridCol w:w="6560"/>
       </w:tblGrid>
       <w:tr>
-        <w:tblPrEx>
-          <w:tblCellMar>
-            <w:top w:w="0" w:type="dxa"/>
-            <w:bottom w:w="0" w:type="dxa"/>
-          </w:tblCellMar>
-        </w:tblPrEx>
         <w:tc>
           <w:tcPr>
             <w:tcW w:w="2800" w:type="dxa"/>
@@ -145,12 +139,6 @@
         </w:tc>
       </w:tr>
       <w:tr>
-        <w:tblPrEx>
-          <w:tblCellMar>
-            <w:top w:w="0" w:type="dxa"/>
-            <w:bottom w:w="0" w:type="dxa"/>
-          </w:tblCellMar>
-        </w:tblPrEx>
         <w:tc>
           <w:tcPr>
             <w:tcW w:w="2800" w:type="dxa"/>
@@ -207,12 +195,6 @@
         </w:tc>
       </w:tr>
       <w:tr>
-        <w:tblPrEx>
-          <w:tblCellMar>
-            <w:top w:w="0" w:type="dxa"/>
-            <w:bottom w:w="0" w:type="dxa"/>
-          </w:tblCellMar>
-        </w:tblPrEx>
         <w:tc>
           <w:tcPr>
             <w:tcW w:w="2800" w:type="dxa"/>
@@ -278,12 +260,6 @@
         </w:tc>
       </w:tr>
       <w:tr>
-        <w:tblPrEx>
-          <w:tblCellMar>
-            <w:top w:w="0" w:type="dxa"/>
-            <w:bottom w:w="0" w:type="dxa"/>
-          </w:tblCellMar>
-        </w:tblPrEx>
         <w:tc>
           <w:tcPr>
             <w:tcW w:w="2800" w:type="dxa"/>
@@ -379,12 +355,6 @@
         <w:gridCol w:w="6860"/>
       </w:tblGrid>
       <w:tr>
-        <w:tblPrEx>
-          <w:tblCellMar>
-            <w:top w:w="0" w:type="dxa"/>
-            <w:bottom w:w="0" w:type="dxa"/>
-          </w:tblCellMar>
-        </w:tblPrEx>
         <w:trPr>
           <w:tblHeader/>
         </w:trPr>
@@ -452,12 +422,6 @@
         </w:tc>
       </w:tr>
       <w:tr>
-        <w:tblPrEx>
-          <w:tblCellMar>
-            <w:top w:w="0" w:type="dxa"/>
-            <w:bottom w:w="0" w:type="dxa"/>
-          </w:tblCellMar>
-        </w:tblPrEx>
         <w:trPr>
           <w:cantSplit/>
         </w:trPr>
@@ -515,12 +479,6 @@
         </w:tc>
       </w:tr>
       <w:tr>
-        <w:tblPrEx>
-          <w:tblCellMar>
-            <w:top w:w="0" w:type="dxa"/>
-            <w:bottom w:w="0" w:type="dxa"/>
-          </w:tblCellMar>
-        </w:tblPrEx>
         <w:trPr>
           <w:cantSplit/>
         </w:trPr>
@@ -572,26 +530,12 @@
           </w:tcPr>
           <w:p>
             <w:r>
-              <w:t xml:space="preserve">Una </w:t>
-            </w:r>
-            <w:proofErr w:type="spellStart"/>
-            <w:r>
-              <w:t>simulacion</w:t>
-            </w:r>
-            <w:proofErr w:type="spellEnd"/>
-            <w:r>
-              <w:t xml:space="preserve"> donde el fuego avanza sobre una milpa empujado por el viento, y el jugador construye cortafuegos a tiempo para salvar la mayor parte posible del cultivo.</w:t>
+              <w:t>Una simulacion donde el fuego avanza sobre una milpa empujado por el viento, y el jugador construye cortafuegos a tiempo para salvar la mayor parte posible del cultivo.</w:t>
             </w:r>
           </w:p>
         </w:tc>
       </w:tr>
       <w:tr>
-        <w:tblPrEx>
-          <w:tblCellMar>
-            <w:top w:w="0" w:type="dxa"/>
-            <w:bottom w:w="0" w:type="dxa"/>
-          </w:tblCellMar>
-        </w:tblPrEx>
         <w:trPr>
           <w:cantSplit/>
         </w:trPr>
@@ -643,50 +587,12 @@
           </w:tcPr>
           <w:p>
             <w:r>
-              <w:t xml:space="preserve">Para un estudiante de bachillerato que quiere entender, jugando, </w:t>
-            </w:r>
-            <w:proofErr w:type="spellStart"/>
-            <w:r>
-              <w:t>por que</w:t>
-            </w:r>
-            <w:proofErr w:type="spellEnd"/>
-            <w:r>
-              <w:t xml:space="preserve"> el viento es el factor que </w:t>
-            </w:r>
-            <w:proofErr w:type="spellStart"/>
-            <w:r>
-              <w:t>mas</w:t>
-            </w:r>
-            <w:proofErr w:type="spellEnd"/>
-            <w:r>
-              <w:t xml:space="preserve"> acelera un incendio </w:t>
-            </w:r>
-            <w:proofErr w:type="spellStart"/>
-            <w:r>
-              <w:t>agricola</w:t>
-            </w:r>
-            <w:proofErr w:type="spellEnd"/>
-            <w:r>
-              <w:t xml:space="preserve"> y </w:t>
-            </w:r>
-            <w:proofErr w:type="spellStart"/>
-            <w:r>
-              <w:t>por que</w:t>
-            </w:r>
-            <w:proofErr w:type="spellEnd"/>
-            <w:r>
-              <w:t xml:space="preserve"> un cortafuego bien ubicado lo detiene — pensado para abrirse y jugarse en el celular en menos de dos minutos.</w:t>
+              <w:t>Para un estudiante de bachillerato que quiere entender, jugando, por que el viento es el factor que mas acelera un incendio agricola y por que un cortafuego bien ubicado lo detiene — pensado para abrirse y jugarse en el celular en menos de dos minutos.</w:t>
             </w:r>
           </w:p>
         </w:tc>
       </w:tr>
       <w:tr>
-        <w:tblPrEx>
-          <w:tblCellMar>
-            <w:top w:w="0" w:type="dxa"/>
-            <w:bottom w:w="0" w:type="dxa"/>
-          </w:tblCellMar>
-        </w:tblPrEx>
         <w:trPr>
           <w:cantSplit/>
         </w:trPr>
@@ -778,12 +684,6 @@
         <w:gridCol w:w="6860"/>
       </w:tblGrid>
       <w:tr>
-        <w:tblPrEx>
-          <w:tblCellMar>
-            <w:top w:w="0" w:type="dxa"/>
-            <w:bottom w:w="0" w:type="dxa"/>
-          </w:tblCellMar>
-        </w:tblPrEx>
         <w:trPr>
           <w:tblHeader/>
         </w:trPr>
@@ -851,12 +751,6 @@
         </w:tc>
       </w:tr>
       <w:tr>
-        <w:tblPrEx>
-          <w:tblCellMar>
-            <w:top w:w="0" w:type="dxa"/>
-            <w:bottom w:w="0" w:type="dxa"/>
-          </w:tblCellMar>
-        </w:tblPrEx>
         <w:trPr>
           <w:cantSplit/>
         </w:trPr>
@@ -911,15 +805,7 @@
               <w:spacing w:after="80"/>
             </w:pPr>
             <w:r>
-              <w:t>1. Cortar — tocar/</w:t>
-            </w:r>
-            <w:proofErr w:type="spellStart"/>
-            <w:r>
-              <w:t>clickear</w:t>
-            </w:r>
-            <w:proofErr w:type="spellEnd"/>
-            <w:r>
-              <w:t xml:space="preserve"> una celda de cultivo para convertirla en cortafuego (no se quema).</w:t>
+              <w:t>1. Cortar — tocar/clickear una celda de cultivo para convertirla en cortafuego (no se quema).</w:t>
             </w:r>
           </w:p>
           <w:p>
@@ -927,39 +813,17 @@
               <w:spacing w:after="80"/>
             </w:pPr>
             <w:r>
-              <w:t xml:space="preserve">2. Avanzar turno — dejar que el fuego se propague un paso, en la </w:t>
-            </w:r>
-            <w:proofErr w:type="spellStart"/>
-            <w:r>
-              <w:t>direccion</w:t>
-            </w:r>
-            <w:proofErr w:type="spellEnd"/>
-            <w:r>
-              <w:t xml:space="preserve"> del viento.</w:t>
-            </w:r>
-          </w:p>
-          <w:p>
-            <w:r>
-              <w:t xml:space="preserve">3. Reiniciar — empezar de nuevo con una </w:t>
-            </w:r>
-            <w:proofErr w:type="spellStart"/>
-            <w:r>
-              <w:t>direccion</w:t>
-            </w:r>
-            <w:proofErr w:type="spellEnd"/>
-            <w:r>
-              <w:t xml:space="preserve"> de viento nueva.</w:t>
+              <w:t>2. Avanzar turno — dejar que el fuego se propague un paso, en la direccion del viento.</w:t>
+            </w:r>
+          </w:p>
+          <w:p>
+            <w:r>
+              <w:t>3. Reiniciar — empezar de nuevo con una direccion de viento nueva.</w:t>
             </w:r>
           </w:p>
         </w:tc>
       </w:tr>
       <w:tr>
-        <w:tblPrEx>
-          <w:tblCellMar>
-            <w:top w:w="0" w:type="dxa"/>
-            <w:bottom w:w="0" w:type="dxa"/>
-          </w:tblCellMar>
-        </w:tblPrEx>
         <w:trPr>
           <w:cantSplit/>
         </w:trPr>
@@ -1012,26 +876,12 @@
           </w:tcPr>
           <w:p>
             <w:r>
-              <w:t xml:space="preserve">El fuego se apaga solo (ya no quedan celdas en llamas) y quedo salvado el 60% o </w:t>
-            </w:r>
-            <w:proofErr w:type="spellStart"/>
-            <w:r>
-              <w:t>mas</w:t>
-            </w:r>
-            <w:proofErr w:type="spellEnd"/>
-            <w:r>
-              <w:t xml:space="preserve"> del cultivo.</w:t>
+              <w:t>El fuego se apaga solo (ya no quedan celdas en llamas) y quedo salvado el 60% o mas del cultivo.</w:t>
             </w:r>
           </w:p>
         </w:tc>
       </w:tr>
       <w:tr>
-        <w:tblPrEx>
-          <w:tblCellMar>
-            <w:top w:w="0" w:type="dxa"/>
-            <w:bottom w:w="0" w:type="dxa"/>
-          </w:tblCellMar>
-        </w:tblPrEx>
         <w:trPr>
           <w:cantSplit/>
         </w:trPr>
@@ -1123,12 +973,6 @@
         <w:gridCol w:w="6860"/>
       </w:tblGrid>
       <w:tr>
-        <w:tblPrEx>
-          <w:tblCellMar>
-            <w:top w:w="0" w:type="dxa"/>
-            <w:bottom w:w="0" w:type="dxa"/>
-          </w:tblCellMar>
-        </w:tblPrEx>
         <w:trPr>
           <w:tblHeader/>
         </w:trPr>
@@ -1196,12 +1040,6 @@
         </w:tc>
       </w:tr>
       <w:tr>
-        <w:tblPrEx>
-          <w:tblCellMar>
-            <w:top w:w="0" w:type="dxa"/>
-            <w:bottom w:w="0" w:type="dxa"/>
-          </w:tblCellMar>
-        </w:tblPrEx>
         <w:trPr>
           <w:cantSplit/>
         </w:trPr>
@@ -1253,34 +1091,12 @@
           </w:tcPr>
           <w:p>
             <w:r>
-              <w:t xml:space="preserve">La cuadricula de la milpa, una flecha que indica la </w:t>
-            </w:r>
-            <w:proofErr w:type="spellStart"/>
-            <w:r>
-              <w:t>direccion</w:t>
-            </w:r>
-            <w:proofErr w:type="spellEnd"/>
-            <w:r>
-              <w:t xml:space="preserve"> del viento, el </w:t>
-            </w:r>
-            <w:proofErr w:type="spellStart"/>
-            <w:r>
-              <w:t>numero</w:t>
-            </w:r>
-            <w:proofErr w:type="spellEnd"/>
-            <w:r>
-              <w:t xml:space="preserve"> de cortafuegos que quedan disponibles, y el porcentaje de milpa salvada actualizado en vivo.</w:t>
+              <w:t>La cuadricula de la milpa, una flecha que indica la direccion del viento, el numero de cortafuegos que quedan disponibles, y el porcentaje de milpa salvada actualizado en vivo.</w:t>
             </w:r>
           </w:p>
         </w:tc>
       </w:tr>
       <w:tr>
-        <w:tblPrEx>
-          <w:tblCellMar>
-            <w:top w:w="0" w:type="dxa"/>
-            <w:bottom w:w="0" w:type="dxa"/>
-          </w:tblCellMar>
-        </w:tblPrEx>
         <w:trPr>
           <w:cantSplit/>
         </w:trPr>
@@ -1340,34 +1156,12 @@
           </w:p>
           <w:p>
             <w:r>
-              <w:t xml:space="preserve">Con el dedo: tocar una celda para cortar, </w:t>
-            </w:r>
-            <w:proofErr w:type="spellStart"/>
-            <w:r>
-              <w:t>boton</w:t>
-            </w:r>
-            <w:proofErr w:type="spellEnd"/>
-            <w:r>
-              <w:t xml:space="preserve"> «Avanzar turno» visible, </w:t>
-            </w:r>
-            <w:proofErr w:type="spellStart"/>
-            <w:r>
-              <w:t>boton</w:t>
-            </w:r>
-            <w:proofErr w:type="spellEnd"/>
-            <w:r>
-              <w:t xml:space="preserve"> «Reiniciar» visible.</w:t>
+              <w:t>Con el dedo: tocar una celda para cortar, boton «Avanzar turno» visible, boton «Reiniciar» visible.</w:t>
             </w:r>
           </w:p>
         </w:tc>
       </w:tr>
       <w:tr>
-        <w:tblPrEx>
-          <w:tblCellMar>
-            <w:top w:w="0" w:type="dxa"/>
-            <w:bottom w:w="0" w:type="dxa"/>
-          </w:tblCellMar>
-        </w:tblPrEx>
         <w:trPr>
           <w:cantSplit/>
         </w:trPr>
@@ -1459,12 +1253,6 @@
         <w:gridCol w:w="6860"/>
       </w:tblGrid>
       <w:tr>
-        <w:tblPrEx>
-          <w:tblCellMar>
-            <w:top w:w="0" w:type="dxa"/>
-            <w:bottom w:w="0" w:type="dxa"/>
-          </w:tblCellMar>
-        </w:tblPrEx>
         <w:trPr>
           <w:tblHeader/>
         </w:trPr>
@@ -1532,12 +1320,6 @@
         </w:tc>
       </w:tr>
       <w:tr>
-        <w:tblPrEx>
-          <w:tblCellMar>
-            <w:top w:w="0" w:type="dxa"/>
-            <w:bottom w:w="0" w:type="dxa"/>
-          </w:tblCellMar>
-        </w:tblPrEx>
         <w:trPr>
           <w:cantSplit/>
         </w:trPr>
@@ -1589,39 +1371,19 @@
           </w:tcPr>
           <w:p>
             <w:r>
-              <w:t xml:space="preserve">Abro el juego y veo una cuadricula verde de 12x12 con una flecha indicando que el viento sopla desde el sureste. Toco varias celdas para construir una </w:t>
-            </w:r>
-            <w:proofErr w:type="spellStart"/>
-            <w:r>
-              <w:t>linea</w:t>
-            </w:r>
-            <w:proofErr w:type="spellEnd"/>
-            <w:r>
-              <w:t xml:space="preserve"> de cortafuego cruzando el camino del viento. Presiono «Avanzar turno» varias veces y veo que el fuego avanza una celda por turno en la </w:t>
-            </w:r>
-            <w:proofErr w:type="spellStart"/>
-            <w:r>
-              <w:t>direccion</w:t>
-            </w:r>
-            <w:proofErr w:type="spellEnd"/>
-            <w:r>
-              <w:t xml:space="preserve"> del viento, </w:t>
-            </w:r>
-            <w:proofErr w:type="spellStart"/>
-            <w:r>
-              <w:t>deteniendose</w:t>
-            </w:r>
-            <w:proofErr w:type="spellEnd"/>
-            <w:r>
-              <w:t xml:space="preserve"> donde </w:t>
-            </w:r>
-            <w:proofErr w:type="spellStart"/>
-            <w:r>
-              <w:t>construi</w:t>
-            </w:r>
-            <w:proofErr w:type="spellEnd"/>
-            <w:r>
-              <w:t xml:space="preserve"> el cortafuego. Cuando el fuego se consume completo, la pantalla muestra «Milpa salvada: 72%» y un mensaje de victoria.</w:t>
+              <w:t xml:space="preserve">Abro el juego y veo una cuadricula verde de </w:t>
+            </w:r>
+            <w:r>
+              <w:t>7</w:t>
+            </w:r>
+            <w:r>
+              <w:t>x</w:t>
+            </w:r>
+            <w:r>
+              <w:t>7</w:t>
+            </w:r>
+            <w:r>
+              <w:t xml:space="preserve"> con una flecha indicando que el viento sopla desde el sureste. Toco varias celdas para construir una linea de cortafuego cruzando el camino del viento. Presiono «Avanzar turno» varias veces y veo que el fuego avanza una celda por turno en la direccion del viento, deteniendose donde construi el cortafuego. Cuando el fuego se consume completo, la pantalla muestra «Milpa salvada: 72%» y un mensaje de victoria.</w:t>
             </w:r>
           </w:p>
         </w:tc>
@@ -1661,12 +1423,6 @@
         <w:gridCol w:w="6860"/>
       </w:tblGrid>
       <w:tr>
-        <w:tblPrEx>
-          <w:tblCellMar>
-            <w:top w:w="0" w:type="dxa"/>
-            <w:bottom w:w="0" w:type="dxa"/>
-          </w:tblCellMar>
-        </w:tblPrEx>
         <w:trPr>
           <w:tblHeader/>
         </w:trPr>
@@ -1734,12 +1490,6 @@
         </w:tc>
       </w:tr>
       <w:tr>
-        <w:tblPrEx>
-          <w:tblCellMar>
-            <w:top w:w="0" w:type="dxa"/>
-            <w:bottom w:w="0" w:type="dxa"/>
-          </w:tblCellMar>
-        </w:tblPrEx>
         <w:trPr>
           <w:cantSplit/>
         </w:trPr>
@@ -1791,42 +1541,12 @@
           </w:tcPr>
           <w:p>
             <w:r>
-              <w:t xml:space="preserve">Sin </w:t>
-            </w:r>
-            <w:proofErr w:type="spellStart"/>
-            <w:r>
-              <w:t>multiples</w:t>
-            </w:r>
-            <w:proofErr w:type="spellEnd"/>
-            <w:r>
-              <w:t xml:space="preserve"> focos de incendio a la vez · sin lluvia ni apagar fuego directamente · sin puntajes guardados entre partidas · sin </w:t>
-            </w:r>
-            <w:proofErr w:type="spellStart"/>
-            <w:r>
-              <w:t>imagenes</w:t>
-            </w:r>
-            <w:proofErr w:type="spellEnd"/>
-            <w:r>
-              <w:t xml:space="preserve"> ni </w:t>
-            </w:r>
-            <w:proofErr w:type="spellStart"/>
-            <w:r>
-              <w:t>librerias</w:t>
-            </w:r>
-            <w:proofErr w:type="spellEnd"/>
-            <w:r>
-              <w:t xml:space="preserve"> externas, solo color solido.</w:t>
+              <w:t>Sin multiples focos de incendio a la vez · sin lluvia ni apagar fuego directamente · sin puntajes guardados entre partidas · sin imagenes ni librerias externas, solo color solido.</w:t>
             </w:r>
           </w:p>
         </w:tc>
       </w:tr>
       <w:tr>
-        <w:tblPrEx>
-          <w:tblCellMar>
-            <w:top w:w="0" w:type="dxa"/>
-            <w:bottom w:w="0" w:type="dxa"/>
-          </w:tblCellMar>
-        </w:tblPrEx>
         <w:trPr>
           <w:cantSplit/>
         </w:trPr>
@@ -1879,15 +1599,7 @@
           </w:tcPr>
           <w:p>
             <w:r>
-              <w:t xml:space="preserve">Agregar la flecha de viento visible y el contador de porcentaje salvado en vivo, que no estaban pedidos en el encargo original — esto </w:t>
-            </w:r>
-            <w:proofErr w:type="spellStart"/>
-            <w:r>
-              <w:t>podria</w:t>
-            </w:r>
-            <w:proofErr w:type="spellEnd"/>
-            <w:r>
-              <w:t xml:space="preserve"> contar para los 2 puntos extra si al final se ve bien terminado.</w:t>
+              <w:t>Agregar la flecha de viento visible y el contador de porcentaje salvado en vivo, que no estaban pedidos en el encargo original — esto podria contar para los 2 puntos extra si al final se ve bien terminado.</w:t>
             </w:r>
           </w:p>
         </w:tc>

</xml_diff>